<commit_message>
docs: add Foundry Local execution-provider screenshot (CUDA-ARM.png)
Embed the official Foundry Local Hardware Acceleration EP table in the
'why not Foundry Local' section as evidence that CUDA/WebGPU have no
Linux arm64 support; regenerate the .docx report.
</commit_message>
<xml_diff>
--- a/Air-Gapped-Copilot-CLI-Report.docx
+++ b/Air-Gapped-Copilot-CLI-Report.docx
@@ -5199,7 +5199,7 @@
       </w:r>
     </w:p>
     <w:bookmarkEnd w:id="31"/>
-    <w:bookmarkStart w:id="32" w:name="X2bb759fce9a8fe96682f917d6b0cde25effd4f3"/>
+    <w:bookmarkStart w:id="35" w:name="X2bb759fce9a8fe96682f917d6b0cde25effd4f3"/>
     <w:p>
       <w:pPr>
         <w:pStyle w:val="Heading1"/>
@@ -5651,6 +5651,157 @@
     </w:tbl>
     <w:p>
       <w:pPr>
+        <w:pStyle w:val="CaptionedFigure"/>
+      </w:pPr>
+      <w:r>
+        <w:drawing>
+          <wp:inline>
+            <wp:extent cx="5334000" cy="2818974"/>
+            <wp:effectExtent b="0" l="0" r="0" t="0"/>
+            <wp:docPr descr="Foundry Local — Hardware Acceleration execution-provider support (official Microsoft docs). The CUDA row lists only Windows x64, Linux x64 — there is no Linux arm64 (aarch64) entry — and WebGPU is limited to Windows x64 / macOS arm64. On this Linux/arm64 host that leaves CPU as the only execution provider." title="" id="33" name="Picture"/>
+            <a:graphic>
+              <a:graphicData uri="http://schemas.openxmlformats.org/drawingml/2006/picture">
+                <pic:pic>
+                  <pic:nvPicPr>
+                    <pic:cNvPr descr="docs/screenshots/CUDA-ARM.png" id="34" name="Picture"/>
+                    <pic:cNvPicPr>
+                      <a:picLocks noChangeArrowheads="1" noChangeAspect="1"/>
+                    </pic:cNvPicPr>
+                  </pic:nvPicPr>
+                  <pic:blipFill>
+                    <a:blip r:embed="rId32"/>
+                    <a:stretch>
+                      <a:fillRect/>
+                    </a:stretch>
+                  </pic:blipFill>
+                  <pic:spPr bwMode="auto">
+                    <a:xfrm>
+                      <a:off x="0" y="0"/>
+                      <a:ext cx="5334000" cy="2818974"/>
+                    </a:xfrm>
+                    <a:prstGeom prst="rect">
+                      <a:avLst/>
+                    </a:prstGeom>
+                    <a:noFill/>
+                    <a:ln w="9525">
+                      <a:noFill/>
+                      <a:headEnd/>
+                      <a:tailEnd/>
+                    </a:ln>
+                  </pic:spPr>
+                </pic:pic>
+              </a:graphicData>
+            </a:graphic>
+          </wp:inline>
+        </w:drawing>
+      </w:r>
+    </w:p>
+    <w:p>
+      <w:pPr>
+        <w:pStyle w:val="ImageCaption"/>
+      </w:pPr>
+      <w:r>
+        <w:t xml:space="preserve">Foundry Local —</w:t>
+      </w:r>
+      <w:r>
+        <w:t xml:space="preserve"> </w:t>
+      </w:r>
+      <w:r>
+        <w:rPr>
+          <w:iCs/>
+          <w:i/>
+        </w:rPr>
+        <w:t xml:space="preserve">Hardware Acceleration</w:t>
+      </w:r>
+      <w:r>
+        <w:t xml:space="preserve"> </w:t>
+      </w:r>
+      <w:r>
+        <w:t xml:space="preserve">execution-provider support (official Microsoft docs). The</w:t>
+      </w:r>
+      <w:r>
+        <w:t xml:space="preserve"> </w:t>
+      </w:r>
+      <w:r>
+        <w:rPr>
+          <w:bCs/>
+          <w:b/>
+        </w:rPr>
+        <w:t xml:space="preserve">CUDA</w:t>
+      </w:r>
+      <w:r>
+        <w:t xml:space="preserve"> </w:t>
+      </w:r>
+      <w:r>
+        <w:t xml:space="preserve">row lists only</w:t>
+      </w:r>
+      <w:r>
+        <w:t xml:space="preserve"> </w:t>
+      </w:r>
+      <w:r>
+        <w:rPr>
+          <w:bCs/>
+          <w:b/>
+        </w:rPr>
+        <w:t xml:space="preserve">Windows x64, Linux x64</w:t>
+      </w:r>
+      <w:r>
+        <w:t xml:space="preserve"> </w:t>
+      </w:r>
+      <w:r>
+        <w:t xml:space="preserve">— there is</w:t>
+      </w:r>
+      <w:r>
+        <w:t xml:space="preserve"> </w:t>
+      </w:r>
+      <w:r>
+        <w:rPr>
+          <w:bCs/>
+          <w:b/>
+        </w:rPr>
+        <w:t xml:space="preserve">no Linux arm64 (aarch64)</w:t>
+      </w:r>
+      <w:r>
+        <w:t xml:space="preserve"> </w:t>
+      </w:r>
+      <w:r>
+        <w:t xml:space="preserve">entry — and</w:t>
+      </w:r>
+      <w:r>
+        <w:t xml:space="preserve"> </w:t>
+      </w:r>
+      <w:r>
+        <w:rPr>
+          <w:bCs/>
+          <w:b/>
+        </w:rPr>
+        <w:t xml:space="preserve">WebGPU</w:t>
+      </w:r>
+      <w:r>
+        <w:t xml:space="preserve"> </w:t>
+      </w:r>
+      <w:r>
+        <w:t xml:space="preserve">is limited to Windows x64 / macOS arm64. On this Linux/arm64 host that leaves</w:t>
+      </w:r>
+      <w:r>
+        <w:t xml:space="preserve"> </w:t>
+      </w:r>
+      <w:r>
+        <w:rPr>
+          <w:bCs/>
+          <w:b/>
+        </w:rPr>
+        <w:t xml:space="preserve">CPU</w:t>
+      </w:r>
+      <w:r>
+        <w:t xml:space="preserve"> </w:t>
+      </w:r>
+      <w:r>
+        <w:t xml:space="preserve">as the only execution provider.</w:t>
+      </w:r>
+    </w:p>
+    <w:p>
+      <w:pPr>
         <w:pStyle w:val="BodyText"/>
       </w:pPr>
       <w:r>
@@ -5892,8 +6043,8 @@
         <w:t xml:space="preserve">path is correct.</w:t>
       </w:r>
     </w:p>
-    <w:bookmarkEnd w:id="32"/>
-    <w:bookmarkStart w:id="39" w:name="observability-grafana"/>
+    <w:bookmarkEnd w:id="35"/>
+    <w:bookmarkStart w:id="42" w:name="observability-grafana"/>
     <w:p>
       <w:pPr>
         <w:pStyle w:val="Heading1"/>
@@ -6202,156 +6353,12 @@
           <wp:inline>
             <wp:extent cx="5334000" cy="5128716"/>
             <wp:effectExtent b="0" l="0" r="0" t="0"/>
-            <wp:docPr descr="Grafana — full campaign window 11:45 → 13:15 (covers every test). Note Processor: GPU, gpt-oss:20b resident in 12 GiB, 125 turns / 84 POSTs / 43% cache-hit / 167K reprocessed. In Throughput (tok/s) the GPU prefill spikes (~2.5–3.0k tok/s) near 12:30 dwarf the CPU era (sub-300 tok/s, flat on this axis). Prompt size &amp; KV cache shows the ~13K-token agent prompt in the CPU era (≈11:50), then the GPU activity from 12:31." title="" id="34" name="Picture"/>
+            <wp:docPr descr="Grafana — full campaign window 11:45 → 13:15 (covers every test). Note Processor: GPU, gpt-oss:20b resident in 12 GiB, 125 turns / 84 POSTs / 43% cache-hit / 167K reprocessed. In Throughput (tok/s) the GPU prefill spikes (~2.5–3.0k tok/s) near 12:30 dwarf the CPU era (sub-300 tok/s, flat on this axis). Prompt size &amp; KV cache shows the ~13K-token agent prompt in the CPU era (≈11:50), then the GPU activity from 12:31." title="" id="37" name="Picture"/>
             <a:graphic>
               <a:graphicData uri="http://schemas.openxmlformats.org/drawingml/2006/picture">
                 <pic:pic>
                   <pic:nvPicPr>
-                    <pic:cNvPr descr="docs/screenshots/grafana-01-campaign-full.png" id="35" name="Picture"/>
-                    <pic:cNvPicPr>
-                      <a:picLocks noChangeArrowheads="1" noChangeAspect="1"/>
-                    </pic:cNvPicPr>
-                  </pic:nvPicPr>
-                  <pic:blipFill>
-                    <a:blip r:embed="rId33"/>
-                    <a:stretch>
-                      <a:fillRect/>
-                    </a:stretch>
-                  </pic:blipFill>
-                  <pic:spPr bwMode="auto">
-                    <a:xfrm>
-                      <a:off x="0" y="0"/>
-                      <a:ext cx="5334000" cy="5128716"/>
-                    </a:xfrm>
-                    <a:prstGeom prst="rect">
-                      <a:avLst/>
-                    </a:prstGeom>
-                    <a:noFill/>
-                    <a:ln w="9525">
-                      <a:noFill/>
-                      <a:headEnd/>
-                      <a:tailEnd/>
-                    </a:ln>
-                  </pic:spPr>
-                </pic:pic>
-              </a:graphicData>
-            </a:graphic>
-          </wp:inline>
-        </w:drawing>
-      </w:r>
-    </w:p>
-    <w:p>
-      <w:pPr>
-        <w:pStyle w:val="ImageCaption"/>
-      </w:pPr>
-      <w:r>
-        <w:t xml:space="preserve">Grafana — full campaign window</w:t>
-      </w:r>
-      <w:r>
-        <w:t xml:space="preserve"> </w:t>
-      </w:r>
-      <w:r>
-        <w:rPr>
-          <w:bCs/>
-          <w:b/>
-        </w:rPr>
-        <w:t xml:space="preserve">11:45 → 13:15</w:t>
-      </w:r>
-      <w:r>
-        <w:t xml:space="preserve"> </w:t>
-      </w:r>
-      <w:r>
-        <w:t xml:space="preserve">(covers every test). Note</w:t>
-      </w:r>
-      <w:r>
-        <w:t xml:space="preserve"> </w:t>
-      </w:r>
-      <w:r>
-        <w:rPr>
-          <w:bCs/>
-          <w:b/>
-        </w:rPr>
-        <w:t xml:space="preserve">Processor: GPU</w:t>
-      </w:r>
-      <w:r>
-        <w:t xml:space="preserve">,</w:t>
-      </w:r>
-      <w:r>
-        <w:t xml:space="preserve"> </w:t>
-      </w:r>
-      <w:r>
-        <w:rPr>
-          <w:rStyle w:val="VerbatimChar"/>
-        </w:rPr>
-        <w:t xml:space="preserve">gpt-oss:20b</w:t>
-      </w:r>
-      <w:r>
-        <w:t xml:space="preserve"> </w:t>
-      </w:r>
-      <w:r>
-        <w:t xml:space="preserve">resident in 12 GiB,</w:t>
-      </w:r>
-      <w:r>
-        <w:t xml:space="preserve"> </w:t>
-      </w:r>
-      <w:r>
-        <w:rPr>
-          <w:bCs/>
-          <w:b/>
-        </w:rPr>
-        <w:t xml:space="preserve">125 turns / 84 POSTs / 43% cache-hit / 167K reprocessed</w:t>
-      </w:r>
-      <w:r>
-        <w:t xml:space="preserve">. In</w:t>
-      </w:r>
-      <w:r>
-        <w:t xml:space="preserve"> </w:t>
-      </w:r>
-      <w:r>
-        <w:rPr>
-          <w:iCs/>
-          <w:i/>
-        </w:rPr>
-        <w:t xml:space="preserve">Throughput (tok/s)</w:t>
-      </w:r>
-      <w:r>
-        <w:t xml:space="preserve"> </w:t>
-      </w:r>
-      <w:r>
-        <w:t xml:space="preserve">the GPU prefill spikes (~2.5–3.0k tok/s) near 12:30 dwarf the CPU era (sub-300 tok/s, flat on this axis).</w:t>
-      </w:r>
-      <w:r>
-        <w:t xml:space="preserve"> </w:t>
-      </w:r>
-      <w:r>
-        <w:rPr>
-          <w:iCs/>
-          <w:i/>
-        </w:rPr>
-        <w:t xml:space="preserve">Prompt size &amp; KV cache</w:t>
-      </w:r>
-      <w:r>
-        <w:t xml:space="preserve"> </w:t>
-      </w:r>
-      <w:r>
-        <w:t xml:space="preserve">shows the ~13K-token agent prompt in the CPU era (≈11:50), then the GPU activity from 12:31.</w:t>
-      </w:r>
-    </w:p>
-    <w:p>
-      <w:pPr>
-        <w:pStyle w:val="CaptionedFigure"/>
-      </w:pPr>
-      <w:r>
-        <w:drawing>
-          <wp:inline>
-            <wp:extent cx="5334000" cy="5128716"/>
-            <wp:effectExtent b="0" l="0" r="0" t="0"/>
-            <wp:docPr descr="Grafana — GPU-accelerated era zoom 12:28 → 13:13. The prefill bursts at ~2.5–3.0k tok/s (12:32–12:35) are the GPU campaign; KV-cache fills to the ~13K-token agent prompt and the parsed turn/HTTP logs show per-request timings (e.g. prompt eval … 860 tokens/second)." title="" id="37" name="Picture"/>
-            <a:graphic>
-              <a:graphicData uri="http://schemas.openxmlformats.org/drawingml/2006/picture">
-                <pic:pic>
-                  <pic:nvPicPr>
-                    <pic:cNvPr descr="docs/screenshots/grafana-02-gpu-era.png" id="38" name="Picture"/>
+                    <pic:cNvPr descr="docs/screenshots/grafana-01-campaign-full.png" id="38" name="Picture"/>
                     <pic:cNvPicPr>
                       <a:picLocks noChangeArrowheads="1" noChangeAspect="1"/>
                     </pic:cNvPicPr>
@@ -6389,7 +6396,7 @@
         <w:pStyle w:val="ImageCaption"/>
       </w:pPr>
       <w:r>
-        <w:t xml:space="preserve">Grafana — GPU-accelerated era zoom</w:t>
+        <w:t xml:space="preserve">Grafana — full campaign window</w:t>
       </w:r>
       <w:r>
         <w:t xml:space="preserve"> </w:t>
@@ -6399,24 +6406,168 @@
           <w:bCs/>
           <w:b/>
         </w:rPr>
-        <w:t xml:space="preserve">12:28 → 13:13</w:t>
-      </w:r>
-      <w:r>
-        <w:t xml:space="preserve">. The prefill bursts at ~2.5–3.0k tok/s (12:32–12:35) are the GPU campaign; KV-cache fills to the ~13K-token agent prompt and the parsed turn/HTTP logs show per-request timings (e.g. </w:t>
+        <w:t xml:space="preserve">11:45 → 13:15</w:t>
+      </w:r>
+      <w:r>
+        <w:t xml:space="preserve"> </w:t>
+      </w:r>
+      <w:r>
+        <w:t xml:space="preserve">(covers every test). Note</w:t>
+      </w:r>
+      <w:r>
+        <w:t xml:space="preserve"> </w:t>
+      </w:r>
+      <w:r>
+        <w:rPr>
+          <w:bCs/>
+          <w:b/>
+        </w:rPr>
+        <w:t xml:space="preserve">Processor: GPU</w:t>
+      </w:r>
+      <w:r>
+        <w:t xml:space="preserve">,</w:t>
+      </w:r>
+      <w:r>
+        <w:t xml:space="preserve"> </w:t>
+      </w:r>
+      <w:r>
+        <w:rPr>
+          <w:rStyle w:val="VerbatimChar"/>
+        </w:rPr>
+        <w:t xml:space="preserve">gpt-oss:20b</w:t>
+      </w:r>
+      <w:r>
+        <w:t xml:space="preserve"> </w:t>
+      </w:r>
+      <w:r>
+        <w:t xml:space="preserve">resident in 12 GiB,</w:t>
+      </w:r>
+      <w:r>
+        <w:t xml:space="preserve"> </w:t>
+      </w:r>
+      <w:r>
+        <w:rPr>
+          <w:bCs/>
+          <w:b/>
+        </w:rPr>
+        <w:t xml:space="preserve">125 turns / 84 POSTs / 43% cache-hit / 167K reprocessed</w:t>
+      </w:r>
+      <w:r>
+        <w:t xml:space="preserve">. In</w:t>
+      </w:r>
+      <w:r>
+        <w:t xml:space="preserve"> </w:t>
       </w:r>
       <w:r>
         <w:rPr>
           <w:iCs/>
           <w:i/>
         </w:rPr>
+        <w:t xml:space="preserve">Throughput (tok/s)</w:t>
+      </w:r>
+      <w:r>
+        <w:t xml:space="preserve"> </w:t>
+      </w:r>
+      <w:r>
+        <w:t xml:space="preserve">the GPU prefill spikes (~2.5–3.0k tok/s) near 12:30 dwarf the CPU era (sub-300 tok/s, flat on this axis).</w:t>
+      </w:r>
+      <w:r>
+        <w:t xml:space="preserve"> </w:t>
+      </w:r>
+      <w:r>
+        <w:rPr>
+          <w:iCs/>
+          <w:i/>
+        </w:rPr>
+        <w:t xml:space="preserve">Prompt size &amp; KV cache</w:t>
+      </w:r>
+      <w:r>
+        <w:t xml:space="preserve"> </w:t>
+      </w:r>
+      <w:r>
+        <w:t xml:space="preserve">shows the ~13K-token agent prompt in the CPU era (≈11:50), then the GPU activity from 12:31.</w:t>
+      </w:r>
+    </w:p>
+    <w:p>
+      <w:pPr>
+        <w:pStyle w:val="CaptionedFigure"/>
+      </w:pPr>
+      <w:r>
+        <w:drawing>
+          <wp:inline>
+            <wp:extent cx="5334000" cy="5128716"/>
+            <wp:effectExtent b="0" l="0" r="0" t="0"/>
+            <wp:docPr descr="Grafana — GPU-accelerated era zoom 12:28 → 13:13. The prefill bursts at ~2.5–3.0k tok/s (12:32–12:35) are the GPU campaign; KV-cache fills to the ~13K-token agent prompt and the parsed turn/HTTP logs show per-request timings (e.g. prompt eval … 860 tokens/second)." title="" id="40" name="Picture"/>
+            <a:graphic>
+              <a:graphicData uri="http://schemas.openxmlformats.org/drawingml/2006/picture">
+                <pic:pic>
+                  <pic:nvPicPr>
+                    <pic:cNvPr descr="docs/screenshots/grafana-02-gpu-era.png" id="41" name="Picture"/>
+                    <pic:cNvPicPr>
+                      <a:picLocks noChangeArrowheads="1" noChangeAspect="1"/>
+                    </pic:cNvPicPr>
+                  </pic:nvPicPr>
+                  <pic:blipFill>
+                    <a:blip r:embed="rId39"/>
+                    <a:stretch>
+                      <a:fillRect/>
+                    </a:stretch>
+                  </pic:blipFill>
+                  <pic:spPr bwMode="auto">
+                    <a:xfrm>
+                      <a:off x="0" y="0"/>
+                      <a:ext cx="5334000" cy="5128716"/>
+                    </a:xfrm>
+                    <a:prstGeom prst="rect">
+                      <a:avLst/>
+                    </a:prstGeom>
+                    <a:noFill/>
+                    <a:ln w="9525">
+                      <a:noFill/>
+                      <a:headEnd/>
+                      <a:tailEnd/>
+                    </a:ln>
+                  </pic:spPr>
+                </pic:pic>
+              </a:graphicData>
+            </a:graphic>
+          </wp:inline>
+        </w:drawing>
+      </w:r>
+    </w:p>
+    <w:p>
+      <w:pPr>
+        <w:pStyle w:val="ImageCaption"/>
+      </w:pPr>
+      <w:r>
+        <w:t xml:space="preserve">Grafana — GPU-accelerated era zoom</w:t>
+      </w:r>
+      <w:r>
+        <w:t xml:space="preserve"> </w:t>
+      </w:r>
+      <w:r>
+        <w:rPr>
+          <w:bCs/>
+          <w:b/>
+        </w:rPr>
+        <w:t xml:space="preserve">12:28 → 13:13</w:t>
+      </w:r>
+      <w:r>
+        <w:t xml:space="preserve">. The prefill bursts at ~2.5–3.0k tok/s (12:32–12:35) are the GPU campaign; KV-cache fills to the ~13K-token agent prompt and the parsed turn/HTTP logs show per-request timings (e.g. </w:t>
+      </w:r>
+      <w:r>
+        <w:rPr>
+          <w:iCs/>
+          <w:i/>
+        </w:rPr>
         <w:t xml:space="preserve">prompt eval … 860 tokens/second</w:t>
       </w:r>
       <w:r>
         <w:t xml:space="preserve">).</w:t>
       </w:r>
     </w:p>
-    <w:bookmarkEnd w:id="39"/>
-    <w:bookmarkStart w:id="40" w:name="findings-limitations-consolidated"/>
+    <w:bookmarkEnd w:id="42"/>
+    <w:bookmarkStart w:id="43" w:name="findings-limitations-consolidated"/>
     <w:p>
       <w:pPr>
         <w:pStyle w:val="Heading1"/>
@@ -6720,8 +6871,8 @@
         <w:t xml:space="preserve">measurements are the ground truth.</w:t>
       </w:r>
     </w:p>
-    <w:bookmarkEnd w:id="40"/>
-    <w:bookmarkStart w:id="41" w:name="recommendations"/>
+    <w:bookmarkEnd w:id="43"/>
+    <w:bookmarkStart w:id="44" w:name="recommendations"/>
     <w:p>
       <w:pPr>
         <w:pStyle w:val="Heading1"/>
@@ -6917,8 +7068,8 @@
         <w:t xml:space="preserve">.</w:t>
       </w:r>
     </w:p>
-    <w:bookmarkEnd w:id="41"/>
-    <w:bookmarkStart w:id="44" w:name="appendix"/>
+    <w:bookmarkEnd w:id="44"/>
+    <w:bookmarkStart w:id="47" w:name="appendix"/>
     <w:p>
       <w:pPr>
         <w:pStyle w:val="Heading1"/>
@@ -6936,7 +7087,7 @@
         <w:t xml:space="preserve">Appendix</w:t>
       </w:r>
     </w:p>
-    <w:bookmarkStart w:id="42" w:name="reproduce-the-campaign"/>
+    <w:bookmarkStart w:id="45" w:name="reproduce-the-campaign"/>
     <w:p>
       <w:pPr>
         <w:pStyle w:val="Heading2"/>
@@ -7121,8 +7272,8 @@
         <w:t xml:space="preserve">./start-observability.sh</w:t>
       </w:r>
     </w:p>
-    <w:bookmarkEnd w:id="42"/>
-    <w:bookmarkStart w:id="43" w:name="file-inventory"/>
+    <w:bookmarkEnd w:id="45"/>
+    <w:bookmarkStart w:id="46" w:name="file-inventory"/>
     <w:p>
       <w:pPr>
         <w:pStyle w:val="Heading2"/>
@@ -7384,8 +7535,8 @@
         </w:tc>
       </w:tr>
     </w:tbl>
-    <w:bookmarkEnd w:id="43"/>
-    <w:bookmarkEnd w:id="44"/>
+    <w:bookmarkEnd w:id="46"/>
+    <w:bookmarkEnd w:id="47"/>
     <w:sectPr/>
   </w:body>
 </w:document>

</xml_diff>